<commit_message>
add new file - usecase: Section System actor
</commit_message>
<xml_diff>
--- a/01-Documentation/04-UseCase/UseCases.docx
+++ b/01-Documentation/04-UseCase/UseCases.docx
@@ -25,23 +25,152 @@
           <w:color w:val="47D459" w:themeColor="accent3" w:themeTint="99"/>
           <w:lang w:val="en-US"/>
         </w:rPr>
-        <w:t xml:space="preserve"> – </w:t>
+        <w:t xml:space="preserve"> – AgroBrain</w:t>
       </w:r>
-      <w:proofErr w:type="spellStart"/>
-      <w:r>
+    </w:p>
+    <w:p>
+      <w:pPr>
+        <w:jc w:val="center"/>
         <w:rPr>
           <w:rFonts w:ascii="Algerian" w:hAnsi="Algerian"/>
           <w:color w:val="47D459" w:themeColor="accent3" w:themeTint="99"/>
           <w:lang w:val="en-US"/>
         </w:rPr>
-        <w:t>AgroBrain</w:t>
+      </w:pPr>
+    </w:p>
+    <w:p>
+      <w:pPr>
+        <w:pStyle w:val="Heading1"/>
+        <w:numPr>
+          <w:ilvl w:val="0"/>
+          <w:numId w:val="2"/>
+        </w:numPr>
+      </w:pPr>
+      <w:r>
+        <w:t>System Actor</w:t>
       </w:r>
-      <w:proofErr w:type="spellEnd"/>
     </w:p>
-    <w:p/>
+    <w:p>
+      <w:pPr>
+        <w:pStyle w:val="ListParagraph"/>
+        <w:numPr>
+          <w:ilvl w:val="0"/>
+          <w:numId w:val="3"/>
+        </w:numPr>
+      </w:pPr>
+      <w:r>
+        <w:t>Operator</w:t>
+      </w:r>
+    </w:p>
+    <w:p>
+      <w:pPr>
+        <w:pStyle w:val="ListParagraph"/>
+        <w:numPr>
+          <w:ilvl w:val="0"/>
+          <w:numId w:val="3"/>
+        </w:numPr>
+      </w:pPr>
+      <w:r>
+        <w:t>Foreman</w:t>
+      </w:r>
+    </w:p>
+    <w:p>
+      <w:pPr>
+        <w:pStyle w:val="ListParagraph"/>
+        <w:numPr>
+          <w:ilvl w:val="0"/>
+          <w:numId w:val="3"/>
+        </w:numPr>
+      </w:pPr>
+      <w:r>
+        <w:t>Field supervisor</w:t>
+      </w:r>
+    </w:p>
+    <w:p>
+      <w:pPr>
+        <w:pStyle w:val="ListParagraph"/>
+        <w:numPr>
+          <w:ilvl w:val="0"/>
+          <w:numId w:val="3"/>
+        </w:numPr>
+      </w:pPr>
+      <w:r>
+        <w:t>Field chief</w:t>
+      </w:r>
+    </w:p>
+    <w:p>
+      <w:pPr>
+        <w:pStyle w:val="ListParagraph"/>
+        <w:numPr>
+          <w:ilvl w:val="0"/>
+          <w:numId w:val="3"/>
+        </w:numPr>
+      </w:pPr>
+      <w:r>
+        <w:t>Management Analytcs</w:t>
+      </w:r>
+    </w:p>
+    <w:p>
+      <w:pPr>
+        <w:pStyle w:val="ListParagraph"/>
+        <w:numPr>
+          <w:ilvl w:val="0"/>
+          <w:numId w:val="3"/>
+        </w:numPr>
+      </w:pPr>
+      <w:r>
+        <w:t>Quality área</w:t>
+      </w:r>
+    </w:p>
+    <w:p>
+      <w:pPr>
+        <w:pStyle w:val="ListParagraph"/>
+        <w:numPr>
+          <w:ilvl w:val="0"/>
+          <w:numId w:val="3"/>
+        </w:numPr>
+      </w:pPr>
+      <w:r>
+        <w:t>Operations gerency</w:t>
+      </w:r>
+    </w:p>
+    <w:p>
+      <w:pPr>
+        <w:pStyle w:val="ListParagraph"/>
+        <w:numPr>
+          <w:ilvl w:val="0"/>
+          <w:numId w:val="3"/>
+        </w:numPr>
+      </w:pPr>
+      <w:r>
+        <w:t>Management area</w:t>
+      </w:r>
+    </w:p>
+    <w:p>
+      <w:pPr>
+        <w:pStyle w:val="ListParagraph"/>
+        <w:numPr>
+          <w:ilvl w:val="0"/>
+          <w:numId w:val="3"/>
+        </w:numPr>
+      </w:pPr>
+      <w:r>
+        <w:t>System administrator</w:t>
+      </w:r>
+    </w:p>
+    <w:p>
+      <w:pPr>
+        <w:ind w:left="360"/>
+      </w:pPr>
+    </w:p>
+    <w:p>
+      <w:pPr>
+        <w:ind w:left="360"/>
+      </w:pPr>
+    </w:p>
     <w:sectPr>
-      <w:headerReference w:type="default" r:id="rId6"/>
-      <w:footerReference w:type="default" r:id="rId7"/>
+      <w:headerReference w:type="default" r:id="rId7"/>
+      <w:footerReference w:type="default" r:id="rId8"/>
       <w:pgSz w:w="11906" w:h="16838"/>
       <w:pgMar w:top="1417" w:right="1701" w:bottom="1417" w:left="1701" w:header="708" w:footer="708" w:gutter="0"/>
       <w:cols w:space="708"/>
@@ -408,6 +537,305 @@
     </w:pPr>
   </w:p>
 </w:hdr>
+</file>
+
+<file path=word/numbering.xml><?xml version="1.0" encoding="utf-8"?>
+<w:numbering xmlns:wpc="http://schemas.microsoft.com/office/word/2010/wordprocessingCanvas" xmlns:cx="http://schemas.microsoft.com/office/drawing/2014/chartex" xmlns:cx1="http://schemas.microsoft.com/office/drawing/2015/9/8/chartex" xmlns:cx2="http://schemas.microsoft.com/office/drawing/2015/10/21/chartex" xmlns:cx3="http://schemas.microsoft.com/office/drawing/2016/5/9/chartex" xmlns:cx4="http://schemas.microsoft.com/office/drawing/2016/5/10/chartex" xmlns:cx5="http://schemas.microsoft.com/office/drawing/2016/5/11/chartex" xmlns:cx6="http://schemas.microsoft.com/office/drawing/2016/5/12/chartex" xmlns:cx7="http://schemas.microsoft.com/office/drawing/2016/5/13/chartex" xmlns:cx8="http://schemas.microsoft.com/office/drawing/2016/5/14/chartex" xmlns:mc="http://schemas.openxmlformats.org/markup-compatibility/2006" xmlns:aink="http://schemas.microsoft.com/office/drawing/2016/ink" xmlns:am3d="http://schemas.microsoft.com/office/drawing/2017/model3d" xmlns:o="urn:schemas-microsoft-com:office:office" xmlns:oel="http://schemas.microsoft.com/office/2019/extlst" xmlns:r="http://schemas.openxmlformats.org/officeDocument/2006/relationships" xmlns:m="http://schemas.openxmlformats.org/officeDocument/2006/math" xmlns:v="urn:schemas-microsoft-com:vml" xmlns:wp14="http://schemas.microsoft.com/office/word/2010/wordprocessingDrawing" xmlns:wp="http://schemas.openxmlformats.org/drawingml/2006/wordprocessingDrawing" xmlns:w10="urn:schemas-microsoft-com:office:word" xmlns:w="http://schemas.openxmlformats.org/wordprocessingml/2006/main" xmlns:w14="http://schemas.microsoft.com/office/word/2010/wordml" xmlns:w15="http://schemas.microsoft.com/office/word/2012/wordml" xmlns:w16cex="http://schemas.microsoft.com/office/word/2018/wordml/cex" xmlns:w16cid="http://schemas.microsoft.com/office/word/2016/wordml/cid" xmlns:w16="http://schemas.microsoft.com/office/word/2018/wordml" xmlns:w16du="http://schemas.microsoft.com/office/word/2023/wordml/word16du" xmlns:w16sdtdh="http://schemas.microsoft.com/office/word/2020/wordml/sdtdatahash" xmlns:w16sdtfl="http://schemas.microsoft.com/office/word/2024/wordml/sdtformatlock" xmlns:w16se="http://schemas.microsoft.com/office/word/2015/wordml/symex" xmlns:wpg="http://schemas.microsoft.com/office/word/2010/wordprocessingGroup" xmlns:wpi="http://schemas.microsoft.com/office/word/2010/wordprocessingInk" xmlns:wne="http://schemas.microsoft.com/office/word/2006/wordml" xmlns:wps="http://schemas.microsoft.com/office/word/2010/wordprocessingShape" mc:Ignorable="w14 w15 w16se w16cid w16 w16cex w16sdtdh w16sdtfl w16du wp14">
+  <w:abstractNum w:abstractNumId="0" w15:restartNumberingAfterBreak="0">
+    <w:nsid w:val="19A57CDB"/>
+    <w:multiLevelType w:val="hybridMultilevel"/>
+    <w:tmpl w:val="5F1639A4"/>
+    <w:lvl w:ilvl="0" w:tplc="0C0A0001">
+      <w:start w:val="1"/>
+      <w:numFmt w:val="bullet"/>
+      <w:lvlText w:val=""/>
+      <w:lvlJc w:val="left"/>
+      <w:pPr>
+        <w:ind w:left="720" w:hanging="360"/>
+      </w:pPr>
+      <w:rPr>
+        <w:rFonts w:ascii="Symbol" w:hAnsi="Symbol" w:hint="default"/>
+      </w:rPr>
+    </w:lvl>
+    <w:lvl w:ilvl="1" w:tplc="0C0A0003" w:tentative="1">
+      <w:start w:val="1"/>
+      <w:numFmt w:val="bullet"/>
+      <w:lvlText w:val="o"/>
+      <w:lvlJc w:val="left"/>
+      <w:pPr>
+        <w:ind w:left="1440" w:hanging="360"/>
+      </w:pPr>
+      <w:rPr>
+        <w:rFonts w:ascii="Courier New" w:hAnsi="Courier New" w:cs="Courier New" w:hint="default"/>
+      </w:rPr>
+    </w:lvl>
+    <w:lvl w:ilvl="2" w:tplc="0C0A0005" w:tentative="1">
+      <w:start w:val="1"/>
+      <w:numFmt w:val="bullet"/>
+      <w:lvlText w:val=""/>
+      <w:lvlJc w:val="left"/>
+      <w:pPr>
+        <w:ind w:left="2160" w:hanging="360"/>
+      </w:pPr>
+      <w:rPr>
+        <w:rFonts w:ascii="Wingdings" w:hAnsi="Wingdings" w:hint="default"/>
+      </w:rPr>
+    </w:lvl>
+    <w:lvl w:ilvl="3" w:tplc="0C0A0001" w:tentative="1">
+      <w:start w:val="1"/>
+      <w:numFmt w:val="bullet"/>
+      <w:lvlText w:val=""/>
+      <w:lvlJc w:val="left"/>
+      <w:pPr>
+        <w:ind w:left="2880" w:hanging="360"/>
+      </w:pPr>
+      <w:rPr>
+        <w:rFonts w:ascii="Symbol" w:hAnsi="Symbol" w:hint="default"/>
+      </w:rPr>
+    </w:lvl>
+    <w:lvl w:ilvl="4" w:tplc="0C0A0003" w:tentative="1">
+      <w:start w:val="1"/>
+      <w:numFmt w:val="bullet"/>
+      <w:lvlText w:val="o"/>
+      <w:lvlJc w:val="left"/>
+      <w:pPr>
+        <w:ind w:left="3600" w:hanging="360"/>
+      </w:pPr>
+      <w:rPr>
+        <w:rFonts w:ascii="Courier New" w:hAnsi="Courier New" w:cs="Courier New" w:hint="default"/>
+      </w:rPr>
+    </w:lvl>
+    <w:lvl w:ilvl="5" w:tplc="0C0A0005" w:tentative="1">
+      <w:start w:val="1"/>
+      <w:numFmt w:val="bullet"/>
+      <w:lvlText w:val=""/>
+      <w:lvlJc w:val="left"/>
+      <w:pPr>
+        <w:ind w:left="4320" w:hanging="360"/>
+      </w:pPr>
+      <w:rPr>
+        <w:rFonts w:ascii="Wingdings" w:hAnsi="Wingdings" w:hint="default"/>
+      </w:rPr>
+    </w:lvl>
+    <w:lvl w:ilvl="6" w:tplc="0C0A0001" w:tentative="1">
+      <w:start w:val="1"/>
+      <w:numFmt w:val="bullet"/>
+      <w:lvlText w:val=""/>
+      <w:lvlJc w:val="left"/>
+      <w:pPr>
+        <w:ind w:left="5040" w:hanging="360"/>
+      </w:pPr>
+      <w:rPr>
+        <w:rFonts w:ascii="Symbol" w:hAnsi="Symbol" w:hint="default"/>
+      </w:rPr>
+    </w:lvl>
+    <w:lvl w:ilvl="7" w:tplc="0C0A0003" w:tentative="1">
+      <w:start w:val="1"/>
+      <w:numFmt w:val="bullet"/>
+      <w:lvlText w:val="o"/>
+      <w:lvlJc w:val="left"/>
+      <w:pPr>
+        <w:ind w:left="5760" w:hanging="360"/>
+      </w:pPr>
+      <w:rPr>
+        <w:rFonts w:ascii="Courier New" w:hAnsi="Courier New" w:cs="Courier New" w:hint="default"/>
+      </w:rPr>
+    </w:lvl>
+    <w:lvl w:ilvl="8" w:tplc="0C0A0005" w:tentative="1">
+      <w:start w:val="1"/>
+      <w:numFmt w:val="bullet"/>
+      <w:lvlText w:val=""/>
+      <w:lvlJc w:val="left"/>
+      <w:pPr>
+        <w:ind w:left="6480" w:hanging="360"/>
+      </w:pPr>
+      <w:rPr>
+        <w:rFonts w:ascii="Wingdings" w:hAnsi="Wingdings" w:hint="default"/>
+      </w:rPr>
+    </w:lvl>
+  </w:abstractNum>
+  <w:abstractNum w:abstractNumId="1" w15:restartNumberingAfterBreak="0">
+    <w:nsid w:val="1ADD468C"/>
+    <w:multiLevelType w:val="hybridMultilevel"/>
+    <w:tmpl w:val="6996FC58"/>
+    <w:lvl w:ilvl="0" w:tplc="0C0A000F">
+      <w:start w:val="1"/>
+      <w:numFmt w:val="decimal"/>
+      <w:lvlText w:val="%1."/>
+      <w:lvlJc w:val="left"/>
+      <w:pPr>
+        <w:ind w:left="720" w:hanging="360"/>
+      </w:pPr>
+    </w:lvl>
+    <w:lvl w:ilvl="1" w:tplc="0C0A0019" w:tentative="1">
+      <w:start w:val="1"/>
+      <w:numFmt w:val="lowerLetter"/>
+      <w:lvlText w:val="%2."/>
+      <w:lvlJc w:val="left"/>
+      <w:pPr>
+        <w:ind w:left="1440" w:hanging="360"/>
+      </w:pPr>
+    </w:lvl>
+    <w:lvl w:ilvl="2" w:tplc="0C0A001B" w:tentative="1">
+      <w:start w:val="1"/>
+      <w:numFmt w:val="lowerRoman"/>
+      <w:lvlText w:val="%3."/>
+      <w:lvlJc w:val="right"/>
+      <w:pPr>
+        <w:ind w:left="2160" w:hanging="180"/>
+      </w:pPr>
+    </w:lvl>
+    <w:lvl w:ilvl="3" w:tplc="0C0A000F" w:tentative="1">
+      <w:start w:val="1"/>
+      <w:numFmt w:val="decimal"/>
+      <w:lvlText w:val="%4."/>
+      <w:lvlJc w:val="left"/>
+      <w:pPr>
+        <w:ind w:left="2880" w:hanging="360"/>
+      </w:pPr>
+    </w:lvl>
+    <w:lvl w:ilvl="4" w:tplc="0C0A0019" w:tentative="1">
+      <w:start w:val="1"/>
+      <w:numFmt w:val="lowerLetter"/>
+      <w:lvlText w:val="%5."/>
+      <w:lvlJc w:val="left"/>
+      <w:pPr>
+        <w:ind w:left="3600" w:hanging="360"/>
+      </w:pPr>
+    </w:lvl>
+    <w:lvl w:ilvl="5" w:tplc="0C0A001B" w:tentative="1">
+      <w:start w:val="1"/>
+      <w:numFmt w:val="lowerRoman"/>
+      <w:lvlText w:val="%6."/>
+      <w:lvlJc w:val="right"/>
+      <w:pPr>
+        <w:ind w:left="4320" w:hanging="180"/>
+      </w:pPr>
+    </w:lvl>
+    <w:lvl w:ilvl="6" w:tplc="0C0A000F" w:tentative="1">
+      <w:start w:val="1"/>
+      <w:numFmt w:val="decimal"/>
+      <w:lvlText w:val="%7."/>
+      <w:lvlJc w:val="left"/>
+      <w:pPr>
+        <w:ind w:left="5040" w:hanging="360"/>
+      </w:pPr>
+    </w:lvl>
+    <w:lvl w:ilvl="7" w:tplc="0C0A0019" w:tentative="1">
+      <w:start w:val="1"/>
+      <w:numFmt w:val="lowerLetter"/>
+      <w:lvlText w:val="%8."/>
+      <w:lvlJc w:val="left"/>
+      <w:pPr>
+        <w:ind w:left="5760" w:hanging="360"/>
+      </w:pPr>
+    </w:lvl>
+    <w:lvl w:ilvl="8" w:tplc="0C0A001B" w:tentative="1">
+      <w:start w:val="1"/>
+      <w:numFmt w:val="lowerRoman"/>
+      <w:lvlText w:val="%9."/>
+      <w:lvlJc w:val="right"/>
+      <w:pPr>
+        <w:ind w:left="6480" w:hanging="180"/>
+      </w:pPr>
+    </w:lvl>
+  </w:abstractNum>
+  <w:abstractNum w:abstractNumId="2" w15:restartNumberingAfterBreak="0">
+    <w:nsid w:val="38C35068"/>
+    <w:multiLevelType w:val="hybridMultilevel"/>
+    <w:tmpl w:val="B94C1262"/>
+    <w:lvl w:ilvl="0" w:tplc="0C0A000F">
+      <w:start w:val="1"/>
+      <w:numFmt w:val="decimal"/>
+      <w:lvlText w:val="%1."/>
+      <w:lvlJc w:val="left"/>
+      <w:pPr>
+        <w:ind w:left="720" w:hanging="360"/>
+      </w:pPr>
+    </w:lvl>
+    <w:lvl w:ilvl="1" w:tplc="0C0A0019" w:tentative="1">
+      <w:start w:val="1"/>
+      <w:numFmt w:val="lowerLetter"/>
+      <w:lvlText w:val="%2."/>
+      <w:lvlJc w:val="left"/>
+      <w:pPr>
+        <w:ind w:left="1440" w:hanging="360"/>
+      </w:pPr>
+    </w:lvl>
+    <w:lvl w:ilvl="2" w:tplc="0C0A001B" w:tentative="1">
+      <w:start w:val="1"/>
+      <w:numFmt w:val="lowerRoman"/>
+      <w:lvlText w:val="%3."/>
+      <w:lvlJc w:val="right"/>
+      <w:pPr>
+        <w:ind w:left="2160" w:hanging="180"/>
+      </w:pPr>
+    </w:lvl>
+    <w:lvl w:ilvl="3" w:tplc="0C0A000F" w:tentative="1">
+      <w:start w:val="1"/>
+      <w:numFmt w:val="decimal"/>
+      <w:lvlText w:val="%4."/>
+      <w:lvlJc w:val="left"/>
+      <w:pPr>
+        <w:ind w:left="2880" w:hanging="360"/>
+      </w:pPr>
+    </w:lvl>
+    <w:lvl w:ilvl="4" w:tplc="0C0A0019" w:tentative="1">
+      <w:start w:val="1"/>
+      <w:numFmt w:val="lowerLetter"/>
+      <w:lvlText w:val="%5."/>
+      <w:lvlJc w:val="left"/>
+      <w:pPr>
+        <w:ind w:left="3600" w:hanging="360"/>
+      </w:pPr>
+    </w:lvl>
+    <w:lvl w:ilvl="5" w:tplc="0C0A001B" w:tentative="1">
+      <w:start w:val="1"/>
+      <w:numFmt w:val="lowerRoman"/>
+      <w:lvlText w:val="%6."/>
+      <w:lvlJc w:val="right"/>
+      <w:pPr>
+        <w:ind w:left="4320" w:hanging="180"/>
+      </w:pPr>
+    </w:lvl>
+    <w:lvl w:ilvl="6" w:tplc="0C0A000F" w:tentative="1">
+      <w:start w:val="1"/>
+      <w:numFmt w:val="decimal"/>
+      <w:lvlText w:val="%7."/>
+      <w:lvlJc w:val="left"/>
+      <w:pPr>
+        <w:ind w:left="5040" w:hanging="360"/>
+      </w:pPr>
+    </w:lvl>
+    <w:lvl w:ilvl="7" w:tplc="0C0A0019" w:tentative="1">
+      <w:start w:val="1"/>
+      <w:numFmt w:val="lowerLetter"/>
+      <w:lvlText w:val="%8."/>
+      <w:lvlJc w:val="left"/>
+      <w:pPr>
+        <w:ind w:left="5760" w:hanging="360"/>
+      </w:pPr>
+    </w:lvl>
+    <w:lvl w:ilvl="8" w:tplc="0C0A001B" w:tentative="1">
+      <w:start w:val="1"/>
+      <w:numFmt w:val="lowerRoman"/>
+      <w:lvlText w:val="%9."/>
+      <w:lvlJc w:val="right"/>
+      <w:pPr>
+        <w:ind w:left="6480" w:hanging="180"/>
+      </w:pPr>
+    </w:lvl>
+  </w:abstractNum>
+  <w:num w:numId="1" w16cid:durableId="1993020147">
+    <w:abstractNumId w:val="1"/>
+  </w:num>
+  <w:num w:numId="2" w16cid:durableId="712920697">
+    <w:abstractNumId w:val="2"/>
+  </w:num>
+  <w:num w:numId="3" w16cid:durableId="873811396">
+    <w:abstractNumId w:val="0"/>
+  </w:num>
+</w:numbering>
 </file>
 
 <file path=word/styles.xml><?xml version="1.0" encoding="utf-8"?>
@@ -1448,11 +1876,12 @@
 
 <file path=word/glossary/fontTable.xml><?xml version="1.0" encoding="utf-8"?>
 <w:fonts xmlns:mc="http://schemas.openxmlformats.org/markup-compatibility/2006" xmlns:r="http://schemas.openxmlformats.org/officeDocument/2006/relationships" xmlns:w="http://schemas.openxmlformats.org/wordprocessingml/2006/main" xmlns:w14="http://schemas.microsoft.com/office/word/2010/wordml" xmlns:w15="http://schemas.microsoft.com/office/word/2012/wordml" xmlns:w16cex="http://schemas.microsoft.com/office/word/2018/wordml/cex" xmlns:w16cid="http://schemas.microsoft.com/office/word/2016/wordml/cid" xmlns:w16="http://schemas.microsoft.com/office/word/2018/wordml" xmlns:w16du="http://schemas.microsoft.com/office/word/2023/wordml/word16du" xmlns:w16sdtdh="http://schemas.microsoft.com/office/word/2020/wordml/sdtdatahash" xmlns:w16sdtfl="http://schemas.microsoft.com/office/word/2024/wordml/sdtformatlock" xmlns:w16se="http://schemas.microsoft.com/office/word/2015/wordml/symex" mc:Ignorable="w14 w15 w16se w16cid w16 w16cex w16sdtdh w16sdtfl w16du">
-  <w:font w:name="Aptos">
-    <w:charset w:val="00"/>
-    <w:family w:val="swiss"/>
+  <w:font w:name="Symbol">
+    <w:panose1 w:val="05050102010706020507"/>
+    <w:charset w:val="02"/>
+    <w:family w:val="roman"/>
     <w:pitch w:val="variable"/>
-    <w:sig w:usb0="20000287" w:usb1="00000003" w:usb2="00000000" w:usb3="00000000" w:csb0="0000019F" w:csb1="00000000"/>
+    <w:sig w:usb0="00000000" w:usb1="10000000" w:usb2="00000000" w:usb3="00000000" w:csb0="80000000" w:csb1="00000000"/>
   </w:font>
   <w:font w:name="Times New Roman">
     <w:panose1 w:val="02020603050405020304"/>
@@ -1460,6 +1889,26 @@
     <w:family w:val="roman"/>
     <w:pitch w:val="variable"/>
     <w:sig w:usb0="E0002EFF" w:usb1="C000785B" w:usb2="00000009" w:usb3="00000000" w:csb0="000001FF" w:csb1="00000000"/>
+  </w:font>
+  <w:font w:name="Courier New">
+    <w:panose1 w:val="02070309020205020404"/>
+    <w:charset w:val="00"/>
+    <w:family w:val="modern"/>
+    <w:pitch w:val="fixed"/>
+    <w:sig w:usb0="E0002EFF" w:usb1="C0007843" w:usb2="00000009" w:usb3="00000000" w:csb0="000001FF" w:csb1="00000000"/>
+  </w:font>
+  <w:font w:name="Wingdings">
+    <w:panose1 w:val="05000000000000000000"/>
+    <w:charset w:val="02"/>
+    <w:family w:val="auto"/>
+    <w:pitch w:val="variable"/>
+    <w:sig w:usb0="00000000" w:usb1="10000000" w:usb2="00000000" w:usb3="00000000" w:csb0="80000000" w:csb1="00000000"/>
+  </w:font>
+  <w:font w:name="Aptos">
+    <w:charset w:val="00"/>
+    <w:family w:val="swiss"/>
+    <w:pitch w:val="variable"/>
+    <w:sig w:usb0="20000287" w:usb1="00000003" w:usb2="00000000" w:usb3="00000000" w:csb0="0000019F" w:csb1="00000000"/>
   </w:font>
   <w:font w:name="Aptos Display">
     <w:charset w:val="00"/>
@@ -1494,8 +1943,11 @@
   </w:compat>
   <w:rsids>
     <w:rsidRoot w:val="00AC0B15"/>
+    <w:rsid w:val="00492386"/>
     <w:rsid w:val="00571825"/>
+    <w:rsid w:val="00893D66"/>
     <w:rsid w:val="00AC0B15"/>
+    <w:rsid w:val="00DD330C"/>
     <w:rsid w:val="00F11634"/>
   </w:rsids>
   <m:mathPr>

</xml_diff>

<commit_message>
add new section: Use case for actor - system administrator
</commit_message>
<xml_diff>
--- a/01-Documentation/04-UseCase/UseCases.docx
+++ b/01-Documentation/04-UseCase/UseCases.docx
@@ -11,6 +11,7 @@
           <w:lang w:val="en-US"/>
         </w:rPr>
       </w:pPr>
+      <w:proofErr w:type="spellStart"/>
       <w:r>
         <w:rPr>
           <w:rFonts w:ascii="Algerian" w:hAnsi="Algerian"/>
@@ -19,14 +20,25 @@
         </w:rPr>
         <w:t>UseCases</w:t>
       </w:r>
+      <w:proofErr w:type="spellEnd"/>
       <w:r>
         <w:rPr>
           <w:rFonts w:ascii="Algerian" w:hAnsi="Algerian"/>
           <w:color w:val="47D459" w:themeColor="accent3" w:themeTint="99"/>
           <w:lang w:val="en-US"/>
         </w:rPr>
-        <w:t xml:space="preserve"> – AgroBrain</w:t>
-      </w:r>
+        <w:t xml:space="preserve"> – </w:t>
+      </w:r>
+      <w:proofErr w:type="spellStart"/>
+      <w:r>
+        <w:rPr>
+          <w:rFonts w:ascii="Algerian" w:hAnsi="Algerian"/>
+          <w:color w:val="47D459" w:themeColor="accent3" w:themeTint="99"/>
+          <w:lang w:val="en-US"/>
+        </w:rPr>
+        <w:t>AgroBrain</w:t>
+      </w:r>
+      <w:proofErr w:type="spellEnd"/>
     </w:p>
     <w:p>
       <w:pPr>
@@ -46,8 +58,13 @@
           <w:numId w:val="2"/>
         </w:numPr>
       </w:pPr>
-      <w:r>
-        <w:t>System Actor</w:t>
+      <w:proofErr w:type="spellStart"/>
+      <w:r>
+        <w:t>System</w:t>
+      </w:r>
+      <w:proofErr w:type="spellEnd"/>
+      <w:r>
+        <w:t xml:space="preserve"> Actor</w:t>
       </w:r>
     </w:p>
     <w:p>
@@ -58,9 +75,11 @@
           <w:numId w:val="3"/>
         </w:numPr>
       </w:pPr>
+      <w:proofErr w:type="spellStart"/>
       <w:r>
         <w:t>Operator</w:t>
       </w:r>
+      <w:proofErr w:type="spellEnd"/>
     </w:p>
     <w:p>
       <w:pPr>
@@ -95,8 +114,13 @@
         </w:numPr>
       </w:pPr>
       <w:r>
-        <w:t>Field chief</w:t>
-      </w:r>
+        <w:t xml:space="preserve">Field </w:t>
+      </w:r>
+      <w:proofErr w:type="spellStart"/>
+      <w:r>
+        <w:t>chief</w:t>
+      </w:r>
+      <w:proofErr w:type="spellEnd"/>
     </w:p>
     <w:p>
       <w:pPr>
@@ -107,8 +131,13 @@
         </w:numPr>
       </w:pPr>
       <w:r>
-        <w:t>Management Analytcs</w:t>
-      </w:r>
+        <w:t xml:space="preserve">Management </w:t>
+      </w:r>
+      <w:proofErr w:type="spellStart"/>
+      <w:r>
+        <w:t>Analytcs</w:t>
+      </w:r>
+      <w:proofErr w:type="spellEnd"/>
     </w:p>
     <w:p>
       <w:pPr>
@@ -118,8 +147,13 @@
           <w:numId w:val="3"/>
         </w:numPr>
       </w:pPr>
-      <w:r>
-        <w:t>Quality área</w:t>
+      <w:proofErr w:type="spellStart"/>
+      <w:r>
+        <w:t>Quality</w:t>
+      </w:r>
+      <w:proofErr w:type="spellEnd"/>
+      <w:r>
+        <w:t xml:space="preserve"> área</w:t>
       </w:r>
     </w:p>
     <w:p>
@@ -130,9 +164,19 @@
           <w:numId w:val="3"/>
         </w:numPr>
       </w:pPr>
-      <w:r>
-        <w:t>Operations gerency</w:t>
-      </w:r>
+      <w:proofErr w:type="spellStart"/>
+      <w:r>
+        <w:t>Operations</w:t>
+      </w:r>
+      <w:proofErr w:type="spellEnd"/>
+      <w:r>
+        <w:t xml:space="preserve"> </w:t>
+      </w:r>
+      <w:proofErr w:type="spellStart"/>
+      <w:r>
+        <w:t>gerency</w:t>
+      </w:r>
+      <w:proofErr w:type="spellEnd"/>
     </w:p>
     <w:p>
       <w:pPr>
@@ -143,8 +187,13 @@
         </w:numPr>
       </w:pPr>
       <w:r>
-        <w:t>Management area</w:t>
-      </w:r>
+        <w:t xml:space="preserve">Management </w:t>
+      </w:r>
+      <w:proofErr w:type="spellStart"/>
+      <w:r>
+        <w:t>area</w:t>
+      </w:r>
+      <w:proofErr w:type="spellEnd"/>
     </w:p>
     <w:p>
       <w:pPr>
@@ -154,18 +203,255 @@
           <w:numId w:val="3"/>
         </w:numPr>
       </w:pPr>
-      <w:r>
-        <w:t>System administrator</w:t>
-      </w:r>
+      <w:proofErr w:type="spellStart"/>
+      <w:r>
+        <w:t>System</w:t>
+      </w:r>
+      <w:proofErr w:type="spellEnd"/>
+      <w:r>
+        <w:t xml:space="preserve"> </w:t>
+      </w:r>
+      <w:proofErr w:type="spellStart"/>
+      <w:r>
+        <w:t>administrator</w:t>
+      </w:r>
+      <w:proofErr w:type="spellEnd"/>
     </w:p>
     <w:p>
       <w:pPr>
-        <w:ind w:left="360"/>
-      </w:pPr>
+        <w:pStyle w:val="Heading1"/>
+        <w:numPr>
+          <w:ilvl w:val="0"/>
+          <w:numId w:val="2"/>
+        </w:numPr>
+      </w:pPr>
+      <w:r>
+        <w:t xml:space="preserve">Use case </w:t>
+      </w:r>
+      <w:proofErr w:type="spellStart"/>
+      <w:r>
+        <w:t>for</w:t>
+      </w:r>
+      <w:proofErr w:type="spellEnd"/>
+      <w:r>
+        <w:t xml:space="preserve"> actor</w:t>
+      </w:r>
     </w:p>
     <w:p>
       <w:pPr>
+        <w:pStyle w:val="ListParagraph"/>
+        <w:numPr>
+          <w:ilvl w:val="1"/>
+          <w:numId w:val="2"/>
+        </w:numPr>
+      </w:pPr>
+      <w:proofErr w:type="spellStart"/>
+      <w:r>
+        <w:t>System</w:t>
+      </w:r>
+      <w:proofErr w:type="spellEnd"/>
+      <w:r>
+        <w:t xml:space="preserve"> </w:t>
+      </w:r>
+      <w:proofErr w:type="spellStart"/>
+      <w:r>
+        <w:t>administrator</w:t>
+      </w:r>
+      <w:proofErr w:type="spellEnd"/>
+    </w:p>
+    <w:p>
+      <w:pPr>
+        <w:pStyle w:val="ListParagraph"/>
+        <w:numPr>
+          <w:ilvl w:val="0"/>
+          <w:numId w:val="5"/>
+        </w:numPr>
+        <w:rPr>
+          <w:b/>
+          <w:bCs/>
+        </w:rPr>
+      </w:pPr>
+      <w:r>
+        <w:rPr>
+          <w:b/>
+          <w:bCs/>
+        </w:rPr>
+        <w:t>CU-001 Login</w:t>
+      </w:r>
+    </w:p>
+    <w:p>
+      <w:pPr>
+        <w:pStyle w:val="ListParagraph"/>
+        <w:ind w:left="1128"/>
+        <w:rPr>
+          <w:lang w:val="en-US"/>
+        </w:rPr>
+      </w:pPr>
+      <w:r>
+        <w:rPr>
+          <w:lang w:val="en-US"/>
+        </w:rPr>
+        <w:t>Description: It allows the us</w:t>
+      </w:r>
+      <w:r>
+        <w:rPr>
+          <w:lang w:val="en-US"/>
+        </w:rPr>
+        <w:t>ers to authenticate on the platform according to their role and credentials</w:t>
+      </w:r>
+    </w:p>
+    <w:p>
+      <w:pPr>
+        <w:pStyle w:val="ListParagraph"/>
+        <w:numPr>
+          <w:ilvl w:val="0"/>
+          <w:numId w:val="5"/>
+        </w:numPr>
+        <w:rPr>
+          <w:b/>
+          <w:bCs/>
+          <w:lang w:val="en-US"/>
+        </w:rPr>
+      </w:pPr>
+      <w:r>
+        <w:rPr>
+          <w:b/>
+          <w:bCs/>
+          <w:lang w:val="en-US"/>
+        </w:rPr>
+        <w:t>CU-002 Manage Users</w:t>
+      </w:r>
+    </w:p>
+    <w:p>
+      <w:pPr>
+        <w:pStyle w:val="ListParagraph"/>
+        <w:ind w:left="1128"/>
+        <w:rPr>
+          <w:lang w:val="en-US"/>
+        </w:rPr>
+      </w:pPr>
+      <w:r>
+        <w:rPr>
+          <w:lang w:val="en-US"/>
+        </w:rPr>
+        <w:t>Description: It allows register, edit, deactivate, and consult systems users</w:t>
+      </w:r>
+    </w:p>
+    <w:p>
+      <w:pPr>
+        <w:pStyle w:val="ListParagraph"/>
+        <w:numPr>
+          <w:ilvl w:val="0"/>
+          <w:numId w:val="5"/>
+        </w:numPr>
+        <w:rPr>
+          <w:b/>
+          <w:bCs/>
+          <w:lang w:val="en-US"/>
+        </w:rPr>
+      </w:pPr>
+      <w:r>
+        <w:rPr>
+          <w:b/>
+          <w:bCs/>
+          <w:lang w:val="en-US"/>
+        </w:rPr>
+        <w:t>CU-003 Roles Management</w:t>
+      </w:r>
+    </w:p>
+    <w:p>
+      <w:pPr>
+        <w:pStyle w:val="ListParagraph"/>
+        <w:ind w:left="1128"/>
+        <w:rPr>
+          <w:lang w:val="en-US"/>
+        </w:rPr>
+      </w:pPr>
+      <w:r>
+        <w:rPr>
+          <w:lang w:val="en-US"/>
+        </w:rPr>
+        <w:t>Description: It allows you to assign and manage access roles for users</w:t>
+      </w:r>
+    </w:p>
+    <w:p>
+      <w:pPr>
+        <w:pStyle w:val="ListParagraph"/>
+        <w:numPr>
+          <w:ilvl w:val="0"/>
+          <w:numId w:val="5"/>
+        </w:numPr>
+        <w:rPr>
+          <w:b/>
+          <w:bCs/>
+          <w:lang w:val="en-US"/>
+        </w:rPr>
+      </w:pPr>
+      <w:r>
+        <w:rPr>
+          <w:b/>
+          <w:bCs/>
+          <w:lang w:val="en-US"/>
+        </w:rPr>
+        <w:t>CU-004 Configure catalog system</w:t>
+      </w:r>
+    </w:p>
+    <w:p>
+      <w:pPr>
+        <w:pStyle w:val="ListParagraph"/>
+        <w:ind w:left="1128"/>
+        <w:rPr>
+          <w:lang w:val="en-US"/>
+        </w:rPr>
+      </w:pPr>
+      <w:r>
+        <w:rPr>
+          <w:lang w:val="en-US"/>
+        </w:rPr>
+        <w:t xml:space="preserve">Description: It allows you to </w:t>
+      </w:r>
+      <w:proofErr w:type="gramStart"/>
+      <w:r>
+        <w:rPr>
+          <w:lang w:val="en-US"/>
+        </w:rPr>
+        <w:t>managed</w:t>
+      </w:r>
+      <w:proofErr w:type="gramEnd"/>
+      <w:r>
+        <w:rPr>
+          <w:lang w:val="en-US"/>
+        </w:rPr>
+        <w:t xml:space="preserve"> basic information such as types of work, fruit variety, types of incidents, and alerts parameters</w:t>
+      </w:r>
+    </w:p>
+    <w:p>
+      <w:pPr>
+        <w:pStyle w:val="ListParagraph"/>
+        <w:ind w:left="1128"/>
+        <w:rPr>
+          <w:lang w:val="en-US"/>
+        </w:rPr>
+      </w:pPr>
+    </w:p>
+    <w:p>
+      <w:pPr>
+        <w:pStyle w:val="ListParagraph"/>
+        <w:numPr>
+          <w:ilvl w:val="1"/>
+          <w:numId w:val="2"/>
+        </w:numPr>
+        <w:rPr>
+          <w:lang w:val="en-US"/>
+        </w:rPr>
+      </w:pPr>
+    </w:p>
+    <w:p>
+      <w:pPr>
         <w:ind w:left="360"/>
+        <w:rPr>
+          <w:lang w:val="en-US"/>
+        </w:rPr>
       </w:pPr>
     </w:p>
     <w:sectPr>
@@ -741,10 +1027,123 @@
     </w:lvl>
   </w:abstractNum>
   <w:abstractNum w:abstractNumId="2" w15:restartNumberingAfterBreak="0">
+    <w:nsid w:val="22CB7DF8"/>
+    <w:multiLevelType w:val="hybridMultilevel"/>
+    <w:tmpl w:val="8F5AE76E"/>
+    <w:lvl w:ilvl="0" w:tplc="0C0A0001">
+      <w:start w:val="1"/>
+      <w:numFmt w:val="bullet"/>
+      <w:lvlText w:val=""/>
+      <w:lvlJc w:val="left"/>
+      <w:pPr>
+        <w:ind w:left="1128" w:hanging="360"/>
+      </w:pPr>
+      <w:rPr>
+        <w:rFonts w:ascii="Symbol" w:hAnsi="Symbol" w:hint="default"/>
+      </w:rPr>
+    </w:lvl>
+    <w:lvl w:ilvl="1" w:tplc="0C0A0003" w:tentative="1">
+      <w:start w:val="1"/>
+      <w:numFmt w:val="bullet"/>
+      <w:lvlText w:val="o"/>
+      <w:lvlJc w:val="left"/>
+      <w:pPr>
+        <w:ind w:left="1848" w:hanging="360"/>
+      </w:pPr>
+      <w:rPr>
+        <w:rFonts w:ascii="Courier New" w:hAnsi="Courier New" w:cs="Courier New" w:hint="default"/>
+      </w:rPr>
+    </w:lvl>
+    <w:lvl w:ilvl="2" w:tplc="0C0A0005" w:tentative="1">
+      <w:start w:val="1"/>
+      <w:numFmt w:val="bullet"/>
+      <w:lvlText w:val=""/>
+      <w:lvlJc w:val="left"/>
+      <w:pPr>
+        <w:ind w:left="2568" w:hanging="360"/>
+      </w:pPr>
+      <w:rPr>
+        <w:rFonts w:ascii="Wingdings" w:hAnsi="Wingdings" w:hint="default"/>
+      </w:rPr>
+    </w:lvl>
+    <w:lvl w:ilvl="3" w:tplc="0C0A0001" w:tentative="1">
+      <w:start w:val="1"/>
+      <w:numFmt w:val="bullet"/>
+      <w:lvlText w:val=""/>
+      <w:lvlJc w:val="left"/>
+      <w:pPr>
+        <w:ind w:left="3288" w:hanging="360"/>
+      </w:pPr>
+      <w:rPr>
+        <w:rFonts w:ascii="Symbol" w:hAnsi="Symbol" w:hint="default"/>
+      </w:rPr>
+    </w:lvl>
+    <w:lvl w:ilvl="4" w:tplc="0C0A0003" w:tentative="1">
+      <w:start w:val="1"/>
+      <w:numFmt w:val="bullet"/>
+      <w:lvlText w:val="o"/>
+      <w:lvlJc w:val="left"/>
+      <w:pPr>
+        <w:ind w:left="4008" w:hanging="360"/>
+      </w:pPr>
+      <w:rPr>
+        <w:rFonts w:ascii="Courier New" w:hAnsi="Courier New" w:cs="Courier New" w:hint="default"/>
+      </w:rPr>
+    </w:lvl>
+    <w:lvl w:ilvl="5" w:tplc="0C0A0005" w:tentative="1">
+      <w:start w:val="1"/>
+      <w:numFmt w:val="bullet"/>
+      <w:lvlText w:val=""/>
+      <w:lvlJc w:val="left"/>
+      <w:pPr>
+        <w:ind w:left="4728" w:hanging="360"/>
+      </w:pPr>
+      <w:rPr>
+        <w:rFonts w:ascii="Wingdings" w:hAnsi="Wingdings" w:hint="default"/>
+      </w:rPr>
+    </w:lvl>
+    <w:lvl w:ilvl="6" w:tplc="0C0A0001" w:tentative="1">
+      <w:start w:val="1"/>
+      <w:numFmt w:val="bullet"/>
+      <w:lvlText w:val=""/>
+      <w:lvlJc w:val="left"/>
+      <w:pPr>
+        <w:ind w:left="5448" w:hanging="360"/>
+      </w:pPr>
+      <w:rPr>
+        <w:rFonts w:ascii="Symbol" w:hAnsi="Symbol" w:hint="default"/>
+      </w:rPr>
+    </w:lvl>
+    <w:lvl w:ilvl="7" w:tplc="0C0A0003" w:tentative="1">
+      <w:start w:val="1"/>
+      <w:numFmt w:val="bullet"/>
+      <w:lvlText w:val="o"/>
+      <w:lvlJc w:val="left"/>
+      <w:pPr>
+        <w:ind w:left="6168" w:hanging="360"/>
+      </w:pPr>
+      <w:rPr>
+        <w:rFonts w:ascii="Courier New" w:hAnsi="Courier New" w:cs="Courier New" w:hint="default"/>
+      </w:rPr>
+    </w:lvl>
+    <w:lvl w:ilvl="8" w:tplc="0C0A0005" w:tentative="1">
+      <w:start w:val="1"/>
+      <w:numFmt w:val="bullet"/>
+      <w:lvlText w:val=""/>
+      <w:lvlJc w:val="left"/>
+      <w:pPr>
+        <w:ind w:left="6888" w:hanging="360"/>
+      </w:pPr>
+      <w:rPr>
+        <w:rFonts w:ascii="Wingdings" w:hAnsi="Wingdings" w:hint="default"/>
+      </w:rPr>
+    </w:lvl>
+  </w:abstractNum>
+  <w:abstractNum w:abstractNumId="3" w15:restartNumberingAfterBreak="0">
     <w:nsid w:val="38C35068"/>
-    <w:multiLevelType w:val="hybridMultilevel"/>
-    <w:tmpl w:val="B94C1262"/>
-    <w:lvl w:ilvl="0" w:tplc="0C0A000F">
+    <w:multiLevelType w:val="multilevel"/>
+    <w:tmpl w:val="7406AD7A"/>
+    <w:lvl w:ilvl="0">
       <w:start w:val="1"/>
       <w:numFmt w:val="decimal"/>
       <w:lvlText w:val="%1."/>
@@ -752,6 +1151,127 @@
       <w:pPr>
         <w:ind w:left="720" w:hanging="360"/>
       </w:pPr>
+    </w:lvl>
+    <w:lvl w:ilvl="1">
+      <w:start w:val="1"/>
+      <w:numFmt w:val="decimal"/>
+      <w:isLgl/>
+      <w:lvlText w:val="%1.%2"/>
+      <w:lvlJc w:val="left"/>
+      <w:pPr>
+        <w:ind w:left="644" w:hanging="360"/>
+      </w:pPr>
+      <w:rPr>
+        <w:rFonts w:hint="default"/>
+      </w:rPr>
+    </w:lvl>
+    <w:lvl w:ilvl="2">
+      <w:start w:val="1"/>
+      <w:numFmt w:val="decimal"/>
+      <w:isLgl/>
+      <w:lvlText w:val="%1.%2.%3"/>
+      <w:lvlJc w:val="left"/>
+      <w:pPr>
+        <w:ind w:left="1080" w:hanging="720"/>
+      </w:pPr>
+      <w:rPr>
+        <w:rFonts w:hint="default"/>
+      </w:rPr>
+    </w:lvl>
+    <w:lvl w:ilvl="3">
+      <w:start w:val="1"/>
+      <w:numFmt w:val="decimal"/>
+      <w:isLgl/>
+      <w:lvlText w:val="%1.%2.%3.%4"/>
+      <w:lvlJc w:val="left"/>
+      <w:pPr>
+        <w:ind w:left="1080" w:hanging="720"/>
+      </w:pPr>
+      <w:rPr>
+        <w:rFonts w:hint="default"/>
+      </w:rPr>
+    </w:lvl>
+    <w:lvl w:ilvl="4">
+      <w:start w:val="1"/>
+      <w:numFmt w:val="decimal"/>
+      <w:isLgl/>
+      <w:lvlText w:val="%1.%2.%3.%4.%5"/>
+      <w:lvlJc w:val="left"/>
+      <w:pPr>
+        <w:ind w:left="1440" w:hanging="1080"/>
+      </w:pPr>
+      <w:rPr>
+        <w:rFonts w:hint="default"/>
+      </w:rPr>
+    </w:lvl>
+    <w:lvl w:ilvl="5">
+      <w:start w:val="1"/>
+      <w:numFmt w:val="decimal"/>
+      <w:isLgl/>
+      <w:lvlText w:val="%1.%2.%3.%4.%5.%6"/>
+      <w:lvlJc w:val="left"/>
+      <w:pPr>
+        <w:ind w:left="1440" w:hanging="1080"/>
+      </w:pPr>
+      <w:rPr>
+        <w:rFonts w:hint="default"/>
+      </w:rPr>
+    </w:lvl>
+    <w:lvl w:ilvl="6">
+      <w:start w:val="1"/>
+      <w:numFmt w:val="decimal"/>
+      <w:isLgl/>
+      <w:lvlText w:val="%1.%2.%3.%4.%5.%6.%7"/>
+      <w:lvlJc w:val="left"/>
+      <w:pPr>
+        <w:ind w:left="1800" w:hanging="1440"/>
+      </w:pPr>
+      <w:rPr>
+        <w:rFonts w:hint="default"/>
+      </w:rPr>
+    </w:lvl>
+    <w:lvl w:ilvl="7">
+      <w:start w:val="1"/>
+      <w:numFmt w:val="decimal"/>
+      <w:isLgl/>
+      <w:lvlText w:val="%1.%2.%3.%4.%5.%6.%7.%8"/>
+      <w:lvlJc w:val="left"/>
+      <w:pPr>
+        <w:ind w:left="1800" w:hanging="1440"/>
+      </w:pPr>
+      <w:rPr>
+        <w:rFonts w:hint="default"/>
+      </w:rPr>
+    </w:lvl>
+    <w:lvl w:ilvl="8">
+      <w:start w:val="1"/>
+      <w:numFmt w:val="decimal"/>
+      <w:isLgl/>
+      <w:lvlText w:val="%1.%2.%3.%4.%5.%6.%7.%8.%9"/>
+      <w:lvlJc w:val="left"/>
+      <w:pPr>
+        <w:ind w:left="2160" w:hanging="1800"/>
+      </w:pPr>
+      <w:rPr>
+        <w:rFonts w:hint="default"/>
+      </w:rPr>
+    </w:lvl>
+  </w:abstractNum>
+  <w:abstractNum w:abstractNumId="4" w15:restartNumberingAfterBreak="0">
+    <w:nsid w:val="71B32BF9"/>
+    <w:multiLevelType w:val="hybridMultilevel"/>
+    <w:tmpl w:val="5420BC72"/>
+    <w:lvl w:ilvl="0" w:tplc="0C0A0001">
+      <w:start w:val="1"/>
+      <w:numFmt w:val="bullet"/>
+      <w:lvlText w:val=""/>
+      <w:lvlJc w:val="left"/>
+      <w:pPr>
+        <w:ind w:left="720" w:hanging="360"/>
+      </w:pPr>
+      <w:rPr>
+        <w:rFonts w:ascii="Symbol" w:hAnsi="Symbol" w:hint="default"/>
+      </w:rPr>
     </w:lvl>
     <w:lvl w:ilvl="1" w:tplc="0C0A0019" w:tentative="1">
       <w:start w:val="1"/>
@@ -830,10 +1350,16 @@
     <w:abstractNumId w:val="1"/>
   </w:num>
   <w:num w:numId="2" w16cid:durableId="712920697">
-    <w:abstractNumId w:val="2"/>
+    <w:abstractNumId w:val="3"/>
   </w:num>
   <w:num w:numId="3" w16cid:durableId="873811396">
     <w:abstractNumId w:val="0"/>
+  </w:num>
+  <w:num w:numId="4" w16cid:durableId="2104103792">
+    <w:abstractNumId w:val="4"/>
+  </w:num>
+  <w:num w:numId="5" w16cid:durableId="1025790648">
+    <w:abstractNumId w:val="2"/>
   </w:num>
 </w:numbering>
 </file>
@@ -1945,8 +2471,8 @@
     <w:rsidRoot w:val="00AC0B15"/>
     <w:rsid w:val="00492386"/>
     <w:rsid w:val="00571825"/>
-    <w:rsid w:val="00893D66"/>
     <w:rsid w:val="00AC0B15"/>
+    <w:rsid w:val="00BC2783"/>
     <w:rsid w:val="00DD330C"/>
     <w:rsid w:val="00F11634"/>
   </w:rsids>

</xml_diff>

<commit_message>
add second section: Field supervisor - field chief and someone usecases
</commit_message>
<xml_diff>
--- a/01-Documentation/04-UseCase/UseCases.docx
+++ b/01-Documentation/04-UseCase/UseCases.docx
@@ -445,10 +445,248 @@
           <w:lang w:val="en-US"/>
         </w:rPr>
       </w:pPr>
-    </w:p>
-    <w:p>
-      <w:pPr>
-        <w:ind w:left="360"/>
+      <w:r>
+        <w:rPr>
+          <w:lang w:val="en-US"/>
+        </w:rPr>
+        <w:t>Field supervisor and field chief</w:t>
+      </w:r>
+    </w:p>
+    <w:p>
+      <w:pPr>
+        <w:pStyle w:val="ListParagraph"/>
+        <w:numPr>
+          <w:ilvl w:val="0"/>
+          <w:numId w:val="5"/>
+        </w:numPr>
+        <w:rPr>
+          <w:b/>
+          <w:bCs/>
+          <w:lang w:val="en-US"/>
+        </w:rPr>
+      </w:pPr>
+      <w:r>
+        <w:rPr>
+          <w:b/>
+          <w:bCs/>
+          <w:lang w:val="en-US"/>
+        </w:rPr>
+        <w:t>CU-005 Management funds</w:t>
+      </w:r>
+    </w:p>
+    <w:p>
+      <w:pPr>
+        <w:pStyle w:val="ListParagraph"/>
+        <w:ind w:left="1128"/>
+        <w:rPr>
+          <w:lang w:val="en-US"/>
+        </w:rPr>
+      </w:pPr>
+      <w:r>
+        <w:rPr>
+          <w:lang w:val="en-US"/>
+        </w:rPr>
+        <w:t>Description: It allows you to register lots associated with a farm, its crop and variety</w:t>
+      </w:r>
+    </w:p>
+    <w:p>
+      <w:pPr>
+        <w:pStyle w:val="ListParagraph"/>
+        <w:numPr>
+          <w:ilvl w:val="0"/>
+          <w:numId w:val="5"/>
+        </w:numPr>
+        <w:rPr>
+          <w:b/>
+          <w:bCs/>
+          <w:lang w:val="en-US"/>
+        </w:rPr>
+      </w:pPr>
+      <w:r>
+        <w:rPr>
+          <w:b/>
+          <w:bCs/>
+          <w:lang w:val="en-US"/>
+        </w:rPr>
+        <w:t>CU-006 Manage batches</w:t>
+      </w:r>
+    </w:p>
+    <w:p>
+      <w:pPr>
+        <w:pStyle w:val="ListParagraph"/>
+        <w:ind w:left="1128"/>
+        <w:rPr>
+          <w:lang w:val="en-US"/>
+        </w:rPr>
+      </w:pPr>
+      <w:r>
+        <w:rPr>
+          <w:lang w:val="en-US"/>
+        </w:rPr>
+        <w:t>Description: It allows you to register lots associated con farm, its crop and variety</w:t>
+      </w:r>
+    </w:p>
+    <w:p>
+      <w:pPr>
+        <w:pStyle w:val="ListParagraph"/>
+        <w:numPr>
+          <w:ilvl w:val="0"/>
+          <w:numId w:val="5"/>
+        </w:numPr>
+        <w:rPr>
+          <w:b/>
+          <w:bCs/>
+          <w:lang w:val="en-US"/>
+        </w:rPr>
+      </w:pPr>
+      <w:r>
+        <w:rPr>
+          <w:b/>
+          <w:bCs/>
+          <w:lang w:val="en-US"/>
+        </w:rPr>
+        <w:t>CU-007 Manage crews</w:t>
+      </w:r>
+    </w:p>
+    <w:p>
+      <w:pPr>
+        <w:pStyle w:val="ListParagraph"/>
+        <w:ind w:left="1128"/>
+        <w:rPr>
+          <w:lang w:val="en-US"/>
+        </w:rPr>
+      </w:pPr>
+      <w:r>
+        <w:rPr>
+          <w:lang w:val="en-US"/>
+        </w:rPr>
+        <w:t>Description: It allows register crew and assigned foreman, operator and labors</w:t>
+      </w:r>
+    </w:p>
+    <w:p>
+      <w:pPr>
+        <w:pStyle w:val="ListParagraph"/>
+        <w:numPr>
+          <w:ilvl w:val="0"/>
+          <w:numId w:val="5"/>
+        </w:numPr>
+        <w:rPr>
+          <w:b/>
+          <w:bCs/>
+          <w:lang w:val="en-US"/>
+        </w:rPr>
+      </w:pPr>
+      <w:r>
+        <w:rPr>
+          <w:b/>
+          <w:bCs/>
+          <w:lang w:val="en-US"/>
+        </w:rPr>
+        <w:t>CU-008 Consulting operative dashboards</w:t>
+      </w:r>
+    </w:p>
+    <w:p>
+      <w:pPr>
+        <w:pStyle w:val="ListParagraph"/>
+        <w:ind w:left="1128"/>
+        <w:rPr>
+          <w:lang w:val="en-US"/>
+        </w:rPr>
+      </w:pPr>
+      <w:r>
+        <w:rPr>
+          <w:lang w:val="en-US"/>
+        </w:rPr>
+        <w:t>Description: It allows you to view key indicators of productivity, progress, quality, alerts and incidents</w:t>
+      </w:r>
+    </w:p>
+    <w:p>
+      <w:pPr>
+        <w:pStyle w:val="ListParagraph"/>
+        <w:numPr>
+          <w:ilvl w:val="0"/>
+          <w:numId w:val="5"/>
+        </w:numPr>
+        <w:rPr>
+          <w:b/>
+          <w:bCs/>
+          <w:lang w:val="en-US"/>
+        </w:rPr>
+      </w:pPr>
+      <w:r>
+        <w:rPr>
+          <w:b/>
+          <w:bCs/>
+          <w:lang w:val="en-US"/>
+        </w:rPr>
+        <w:t>CU-009 Progress Inquiry by fund</w:t>
+      </w:r>
+    </w:p>
+    <w:p>
+      <w:pPr>
+        <w:pStyle w:val="ListParagraph"/>
+        <w:ind w:left="1128"/>
+        <w:rPr>
+          <w:lang w:val="en-US"/>
+        </w:rPr>
+      </w:pPr>
+      <w:proofErr w:type="spellStart"/>
+      <w:r>
+        <w:rPr>
+          <w:lang w:val="en-US"/>
+        </w:rPr>
+        <w:t>dEScriptin</w:t>
+      </w:r>
+      <w:proofErr w:type="spellEnd"/>
+      <w:r>
+        <w:rPr>
+          <w:lang w:val="en-US"/>
+        </w:rPr>
+        <w:t>: Allows you to review the daily, weekly, or cumulative progress by fund</w:t>
+      </w:r>
+    </w:p>
+    <w:p>
+      <w:pPr>
+        <w:pStyle w:val="ListParagraph"/>
+        <w:numPr>
+          <w:ilvl w:val="0"/>
+          <w:numId w:val="5"/>
+        </w:numPr>
+        <w:rPr>
+          <w:b/>
+          <w:bCs/>
+          <w:lang w:val="en-US"/>
+        </w:rPr>
+      </w:pPr>
+      <w:r>
+        <w:rPr>
+          <w:b/>
+          <w:bCs/>
+          <w:lang w:val="en-US"/>
+        </w:rPr>
+        <w:lastRenderedPageBreak/>
+        <w:t>CU-010 Progress Inquiry by crews</w:t>
+      </w:r>
+    </w:p>
+    <w:p>
+      <w:pPr>
+        <w:pStyle w:val="ListParagraph"/>
+        <w:ind w:left="1128"/>
+        <w:rPr>
+          <w:lang w:val="en-US"/>
+        </w:rPr>
+      </w:pPr>
+      <w:r>
+        <w:rPr>
+          <w:lang w:val="en-US"/>
+        </w:rPr>
+        <w:t>Description: It allows you to review the performance of each team according to crates, quality and goal achievement</w:t>
+      </w:r>
+    </w:p>
+    <w:p>
+      <w:pPr>
+        <w:pStyle w:val="ListParagraph"/>
+        <w:ind w:left="1128"/>
         <w:rPr>
           <w:lang w:val="en-US"/>
         </w:rPr>
@@ -1029,7 +1267,7 @@
   <w:abstractNum w:abstractNumId="2" w15:restartNumberingAfterBreak="0">
     <w:nsid w:val="22CB7DF8"/>
     <w:multiLevelType w:val="hybridMultilevel"/>
-    <w:tmpl w:val="8F5AE76E"/>
+    <w:tmpl w:val="466041DC"/>
     <w:lvl w:ilvl="0" w:tplc="0C0A0001">
       <w:start w:val="1"/>
       <w:numFmt w:val="bullet"/>
@@ -2471,8 +2709,8 @@
     <w:rsidRoot w:val="00AC0B15"/>
     <w:rsid w:val="00492386"/>
     <w:rsid w:val="00571825"/>
+    <w:rsid w:val="008D18AF"/>
     <w:rsid w:val="00AC0B15"/>
-    <w:rsid w:val="00BC2783"/>
     <w:rsid w:val="00DD330C"/>
     <w:rsid w:val="00F11634"/>
   </w:rsids>

</xml_diff>